<commit_message>
Leppington teaming briefs Rev C: rates and insurance aligned with final FP
Co-Authored-By: Claude Opus 5.5 <noreply@anthropic.com>
Claude-Session: https://claude.ai/code/session_01RKGFyarCMuMinKYL7AiBap
</commit_message>
<xml_diff>
--- a/FP/VP527224/Final/03. 2026-092 Response Schedule (PART 6)_JCE_FILLED.docx
+++ b/FP/VP527224/Final/03. 2026-092 Response Schedule (PART 6)_JCE_FILLED.docx
@@ -3690,7 +3690,7 @@
         <w:rPr>
           <w:i w:val="0"/>
         </w:rPr>
-        <w:t>Douglas Shire has a population of more than 12,000 and a tourism economy of about $574 million with more than 2,500 jobs, built on the Great Barrier Reef and the Daintree. The closure of the Mossman Mill, COVID-19 and Tropical Cyclone Jasper have shown the need to diversify the economy, and the State's Mossman Transition Plan funds this study. Council has already completed the Port Douglas Waterfront South Tourism and Marine Master Plan (2019) and has argued in its submission on the draft FNQ Regional Plan for a south dock industry precinct, while the draft plan maps Dickson Inlet as a regional biodiversity corridor. Jayden Callen worked in Townsville from 2023 to 2026, managed civil design for remote Cape York communities, and has worked on the client side for a Far North Queensland council.</w:t>
+        <w:t>Douglas Shire has a population of more than 12,000 and a tourism economy of about $574 million with more than 2,500 jobs, built on the Great Barrier Reef and the Daintree. The closure of the Mossman Mill, COVID-19 and Tropical Cyclone Jasper have shown the need to diversify the economy, and the State's Mossman Transition Plan funds this study. Council has already completed the Port Douglas Waterfront South Tourism and Marine Master Plan (2019) and has argued in its submission on the draft FNQ Regional Plan for a south dock industry precinct, while the draft plan maps Dickson Inlet as a regional biodiversity corridor. Jayden Callen was based in Townsville until 05/2026, managed civil design for remote Cape York communities, and has worked on the client side for a Far North Queensland council.</w:t>
       </w:r>
     </w:p>
     <w:p>
@@ -8528,7 +8528,7 @@
         <w:rPr>
           <w:i w:val="0"/>
         </w:rPr>
-        <w:t>JCE Infrastructure is a principal-led civil and hydraulic engineering consultancy based at Gunnedah NSW and working across NSW and Queensland. Jayden Callen managed engineering work from Townsville from 2023 to 2026, including remote Cape York communities and Defence works at HMAS Cairns, and has worked on the client side for a Far North Queensland council. Engineering opinions in the study are signed by RPEQs. Value-Add proposals: grant-ready project summary and roadmap; staged costings so early works can be funded separately; master plan in GIS and CAD formats.</w:t>
+        <w:t>JCE Infrastructure is a principal-led civil and hydraulic engineering consultancy based at Gunnedah NSW and working across NSW and Queensland. Jayden Callen was based in Townsville until 05/2026, managing engineering work that included remote Cape York communities and Defence works at HMAS Cairns, and has worked on the client side for a Far North Queensland council. Engineering opinions in the study are signed by RPEQs. Value-Add proposals: grant-ready project summary and roadmap; staged costings so early works can be funded separately; master plan in GIS and CAD formats.</w:t>
       </w:r>
     </w:p>
     <w:p>

</xml_diff>